<commit_message>
docs: update Word report to feature VNPAY Sandbox instead of VietQR
</commit_message>
<xml_diff>
--- a/m 2494802010002_DoThienBao_GIUA KY.docx
+++ b/m 2494802010002_DoThienBao_GIUA KY.docx
@@ -333,7 +333,7 @@
           <w:rFonts w:ascii="Times New Roman" w:hAnsi="Times New Roman"/>
           <w:sz w:val="26"/>
         </w:rPr>
-        <w:t>- Xây dựng luồng giỏ hàng và thanh toán đặt cọc an toàn, tạo mã VietQR tự động.</w:t>
+        <w:t>- Xây dựng luồng giỏ hàng và thanh toán đặt cọc an toàn, tích hợp cổng thanh toán VNPAY (Môi trường Sandbox).</w:t>
       </w:r>
     </w:p>
     <w:p>
@@ -1520,7 +1520,7 @@
           <w:rFonts w:ascii="Times New Roman" w:hAnsi="Times New Roman"/>
           <w:sz w:val="26"/>
         </w:rPr>
-        <w:t>Tuy nhiên, hệ thống vẫn tồn tại một số hạn chế kỹ thuật. Tính năng 'Dán link sản phẩm' hiện tại chưa bóc tách (scrape) được toàn bộ dữ liệu phức tạp từ các trang thương mại điện tử bảo mật cao (như Amazon có cơ chế chống bot). Việc thanh toán đặt cọc qua mã VietQR hiện đang phải dựa vào việc nhân sự kiểm tra tài khoản ngân hàng và cập nhật thủ công trên hệ thống, chưa tích hợp Webhook để xác nhận tự động theo thời gian thực.</w:t>
+        <w:t>Tuy nhiên, tính năng 'Dán link sản phẩm' hiện tại chưa bóc tách (scrape) được toàn bộ dữ liệu phức tạp từ các trang thương mại điện tử bảo mật cao (như Amazon có cơ chế chống bot). Điểm cộng lớn của phiên bản hiện tại là đã thay thế việc kiểm tra chuyển khoản thủ công bằng việc tích hợp thành công Cổng thanh toán VNPAY (môi trường Sandbox) để tự động hóa hoàn toàn luồng nhận cọc và xác nhận trạng thái đơn hàng.</w:t>
       </w:r>
     </w:p>
     <w:p>
@@ -1567,7 +1567,7 @@
           <w:rFonts w:ascii="Times New Roman" w:hAnsi="Times New Roman"/>
           <w:sz w:val="26"/>
         </w:rPr>
-        <w:t>- Về mặt thanh toán: Kiến nghị tích hợp Webhook từ các nhà cung cấp dịch vụ ngân hàng (như SePay hoặc PayOS) để khi khách hàng quét mã QR thanh toán thành công, ngân hàng sẽ tự động gọi API báo cho ChillBanana cập nhật trạng thái đơn hàng từ 'PENDING_DEPOSIT' sang 'PURCHASING_JP' trong vòng 3 giây, loại bỏ hoàn toàn sự can thiệp thủ công.</w:t>
+        <w:t>- Về mặt thanh toán: Hiện tại hệ thống đang sử dụng cổng thanh toán VNPAY ở môi trường Sandbox phục vụ cho mục đích thử nghiệm và làm đồ án. Để đưa vào hoạt động kinh doanh thực tế, kiến nghị thực hiện thủ tục đăng ký định danh Merchant (KYC) với VNPAY để chuyển đổi API key sang môi trường Production, cho phép nhận tiền thật từ khách hàng.</w:t>
       </w:r>
     </w:p>
     <w:p>

</xml_diff>

<commit_message>
fix: VNPAY return URL auto-detect Vercel host; docs: add Vercel+Neon+VNPAY sections to Word report
</commit_message>
<xml_diff>
--- a/m 2494802010002_DoThienBao_GIUA KY.docx
+++ b/m 2494802010002_DoThienBao_GIUA KY.docx
@@ -928,6 +928,76 @@
           <w:sz w:val="26"/>
         </w:rPr>
         <w:t>- Google Gemini 2.5 Flash: Tích hợp qua thư viện @google/genai, cung cấp khả năng hiểu ngôn ngữ tự nhiên để đóng vai trò trợ lý tư vấn (Omotenashi/Vietnamese style) và trích xuất dữ liệu ẩn.</w:t>
+      </w:r>
+    </w:p>
+    <w:p>
+      <w:pPr>
+        <w:pStyle w:val="Heading3"/>
+      </w:pPr>
+      <w:r>
+        <w:rPr>
+          <w:rFonts w:ascii="Times New Roman" w:hAnsi="Times New Roman"/>
+          <w:i/>
+          <w:color w:val="000000"/>
+          <w:sz w:val="26"/>
+        </w:rPr>
+        <w:t>2.2.5. Triển khai (Deployment)</w:t>
+      </w:r>
+    </w:p>
+    <w:p>
+      <w:pPr>
+        <w:spacing w:after="120" w:line="312" w:lineRule="auto"/>
+        <w:ind w:firstLine="720"/>
+        <w:jc w:val="both"/>
+      </w:pPr>
+      <w:r>
+        <w:rPr>
+          <w:rFonts w:ascii="Times New Roman" w:hAnsi="Times New Roman"/>
+          <w:sz w:val="26"/>
+        </w:rPr>
+        <w:t>- Vercel (Serverless Platform): Nền tảng triển khai ứng dụng Next.js được lựa chọn do khả năng tích hợp sâu với framework. Vercel tự động tạo môi trường Preview cho mỗi commit, hỗ trợ CI/CD không cần cấu hình phức tạp và cung cấp biến môi trường VERCEL_URL tự động để các API nội bộ nhận biết đúng địa chỉ host đang chạy.</w:t>
+      </w:r>
+    </w:p>
+    <w:p>
+      <w:pPr>
+        <w:spacing w:after="120" w:line="312" w:lineRule="auto"/>
+        <w:ind w:firstLine="720"/>
+        <w:jc w:val="both"/>
+      </w:pPr>
+      <w:r>
+        <w:rPr>
+          <w:rFonts w:ascii="Times New Roman" w:hAnsi="Times New Roman"/>
+          <w:sz w:val="26"/>
+        </w:rPr>
+        <w:t>- Neon (Serverless PostgreSQL): Dịch vụ PostgreSQL dạng serverless được lựa chọn thay thế cho SQLite khi đưa lên Vercel. Neon hỗ trợ Pooling Connection đặc biệt phù hợp với môi trường serverless, giải quyết bài toán giới hạn kết nối đồng thời mà SQLite và các CSDL truyền thống không thể đáp ứng.</w:t>
+      </w:r>
+    </w:p>
+    <w:p>
+      <w:pPr>
+        <w:pStyle w:val="Heading3"/>
+      </w:pPr>
+      <w:r>
+        <w:rPr>
+          <w:rFonts w:ascii="Times New Roman" w:hAnsi="Times New Roman"/>
+          <w:i/>
+          <w:color w:val="000000"/>
+          <w:sz w:val="26"/>
+        </w:rPr>
+        <w:t>2.2.6. Cổng thanh toán (Payment Gateway)</w:t>
+      </w:r>
+    </w:p>
+    <w:p>
+      <w:pPr>
+        <w:spacing w:after="120" w:line="312" w:lineRule="auto"/>
+        <w:ind w:firstLine="720"/>
+        <w:jc w:val="both"/>
+      </w:pPr>
+      <w:r>
+        <w:rPr>
+          <w:rFonts w:ascii="Times New Roman" w:hAnsi="Times New Roman"/>
+          <w:sz w:val="26"/>
+        </w:rPr>
+        <w:t>- VNPAY Sandbox: Cổng thanh toán trực tuyến của VNPAY được tích hợp ở môi trường Sandbox (thử nghiệm). Hệ thống tự sinh URL thanh toán có chữ ký HMAC-SHA512, chuyển hướng khách hàng sang trang VNPAY để thực hiện thanh toán, sau đó nhận kết quả qua Return URL (webhook một chiều). Khi thanh toán thành công, trạng thái đơn hàng tự động được cập nhật sang DEPOSITED_50 và PURCHASING_JP trong cơ sở dữ liệu mà không cần nhân viên can thiệp thủ công.</w:t>
       </w:r>
     </w:p>
     <w:p>

</xml_diff>